<commit_message>
Documents: architecture reference v2.0 - review response section
Adds a review-response section on page one: states that this supersedes
Schema, AI Stack and Branches v1.0 and why that file was incomplete, and
maps each of the six points raised in review to where it is answered -
branches to Part 4, prompt caching to Section 1.1, the table totals to the
header strip and Part 2, backups to Part 9 and Section 1.2, deployment and
rollback to Part 10, the frontier alias to Section 1.3 and Part 3.4.

Also records the count correction explicitly rather than fixing it
quietly: 83 base tables plus 3 views, not 86 tables with three arriving by
migration. The reviewer's count was right and the document's was wrong.

57 tables, 226 rows.

Co-Authored-By: Claude Opus 5 <noreply@anthropic.com>
</commit_message>
<xml_diff>
--- a/Preckon-system/Documents/Preckon_Architecture_Reference_v2.0.docx
+++ b/Preckon-system/Documents/Preckon_Architecture_Reference_v2.0.docx
@@ -265,6 +265,403 @@
     <w:p>
       <w:pPr>
         <w:spacing w:after="160"/>
+      </w:pPr>
+    </w:p>
+    <w:p>
+      <w:pPr>
+        <w:spacing w:before="260" w:after="80" w:line="307" w:lineRule="auto"/>
+      </w:pPr>
+      <w:r>
+        <w:rPr>
+          <w:rFonts w:ascii="Calibri" w:hAnsi="Calibri"/>
+          <w:b/>
+          <w:color w:val="172126"/>
+          <w:sz w:val="22"/>
+        </w:rPr>
+        <w:t>Review response — this document supersedes Schema, AI Stack and Branches v1.0</w:t>
+      </w:r>
+    </w:p>
+    <w:p>
+      <w:pPr>
+        <w:spacing w:before="0" w:after="140" w:line="307" w:lineRule="auto"/>
+      </w:pPr>
+      <w:r>
+        <w:rPr>
+          <w:rFonts w:ascii="Georgia" w:hAnsi="Georgia"/>
+          <w:b w:val="0"/>
+          <w:color w:val="526068"/>
+          <w:sz w:val="19"/>
+        </w:rPr>
+        <w:t>Revised 5 September 2026. The earlier file circulated for review was incomplete: its title promised a branches section that the file did not contain, because the document was open in Word while it was being generated and that section was overwritten. It has been withdrawn. Every point raised in review is answered below, and the table says where.</w:t>
+      </w:r>
+    </w:p>
+    <w:tbl>
+      <w:tblPr>
+        <w:tblW w:type="auto" w:w="0"/>
+        <w:jc w:val="left"/>
+        <w:tblLook w:firstColumn="1" w:firstRow="1" w:lastColumn="0" w:lastRow="0" w:noHBand="0" w:noVBand="1" w:val="04A0"/>
+        <w:tblBorders>
+          <w:top w:val="single" w:sz="4" w:space="0" w:color="D8DEE2"/>
+          <w:left w:val="single" w:sz="4" w:space="0" w:color="D8DEE2"/>
+          <w:bottom w:val="single" w:sz="4" w:space="0" w:color="D8DEE2"/>
+          <w:right w:val="single" w:sz="4" w:space="0" w:color="D8DEE2"/>
+          <w:insideH w:val="single" w:sz="4" w:space="0" w:color="D8DEE2"/>
+          <w:insideV w:val="single" w:sz="4" w:space="0" w:color="D8DEE2"/>
+        </w:tblBorders>
+      </w:tblPr>
+      <w:tblGrid>
+        <w:gridCol w:w="5040"/>
+        <w:gridCol w:w="5040"/>
+      </w:tblGrid>
+      <w:tr>
+        <w:tc>
+          <w:tcPr>
+            <w:tcW w:type="dxa" w:w="3312"/>
+            <w:shd w:val="clear" w:fill="F0F3F4"/>
+          </w:tcPr>
+          <w:p>
+            <w:r/>
+            <w:r>
+              <w:rPr>
+                <w:rFonts w:ascii="Calibri" w:hAnsi="Calibri"/>
+                <w:b/>
+                <w:color w:val="667279"/>
+                <w:sz w:val="13"/>
+              </w:rPr>
+              <w:t>REVIEW POINT</w:t>
+            </w:r>
+          </w:p>
+        </w:tc>
+        <w:tc>
+          <w:tcPr>
+            <w:tcW w:type="dxa" w:w="6624"/>
+            <w:shd w:val="clear" w:fill="F0F3F4"/>
+          </w:tcPr>
+          <w:p>
+            <w:r/>
+            <w:r>
+              <w:rPr>
+                <w:rFonts w:ascii="Calibri" w:hAnsi="Calibri"/>
+                <w:b/>
+                <w:color w:val="667279"/>
+                <w:sz w:val="13"/>
+              </w:rPr>
+              <w:t>WHERE IT IS ANSWERED NOW</w:t>
+            </w:r>
+          </w:p>
+        </w:tc>
+      </w:tr>
+      <w:tr>
+        <w:tc>
+          <w:tcPr>
+            <w:tcW w:type="dxa" w:w="3312"/>
+          </w:tcPr>
+          <w:p>
+            <w:pPr>
+              <w:spacing w:line="278" w:lineRule="auto" w:after="0"/>
+            </w:pPr>
+            <w:r/>
+            <w:r>
+              <w:rPr>
+                <w:rFonts w:ascii="Calibri" w:hAnsi="Calibri"/>
+                <w:b/>
+                <w:color w:val="172126"/>
+                <w:sz w:val="15"/>
+              </w:rPr>
+              <w:t>Title says ‘and branches’ but no branches section</w:t>
+            </w:r>
+          </w:p>
+        </w:tc>
+        <w:tc>
+          <w:tcPr>
+            <w:tcW w:type="dxa" w:w="6624"/>
+          </w:tcPr>
+          <w:p>
+            <w:pPr>
+              <w:spacing w:line="278" w:lineRule="auto" w:after="0"/>
+            </w:pPr>
+            <w:r/>
+            <w:r>
+              <w:rPr>
+                <w:rFonts w:ascii="Calibri" w:hAnsi="Calibri"/>
+                <w:b w:val="0"/>
+                <w:color w:val="526068"/>
+                <w:sz w:val="15"/>
+              </w:rPr>
+              <w:t>Part 4 — Branches. Four repositories, nine branches, divergence measured against each. The point was correct: the section was lost, not omitted</w:t>
+            </w:r>
+          </w:p>
+        </w:tc>
+      </w:tr>
+      <w:tr>
+        <w:tc>
+          <w:tcPr>
+            <w:tcW w:type="dxa" w:w="3312"/>
+          </w:tcPr>
+          <w:p>
+            <w:pPr>
+              <w:spacing w:line="278" w:lineRule="auto" w:after="0"/>
+            </w:pPr>
+            <w:r/>
+            <w:r>
+              <w:rPr>
+                <w:rFonts w:ascii="Calibri" w:hAnsi="Calibri"/>
+                <w:b/>
+                <w:color w:val="172126"/>
+                <w:sz w:val="15"/>
+              </w:rPr>
+              <w:t>Prompt caching is the most valuable finding but is buried at the end</w:t>
+            </w:r>
+          </w:p>
+        </w:tc>
+        <w:tc>
+          <w:tcPr>
+            <w:tcW w:type="dxa" w:w="6624"/>
+          </w:tcPr>
+          <w:p>
+            <w:pPr>
+              <w:spacing w:line="278" w:lineRule="auto" w:after="0"/>
+            </w:pPr>
+            <w:r/>
+            <w:r>
+              <w:rPr>
+                <w:rFonts w:ascii="Calibri" w:hAnsi="Calibri"/>
+                <w:b w:val="0"/>
+                <w:color w:val="526068"/>
+                <w:sz w:val="15"/>
+              </w:rPr>
+              <w:t>Section 1.1 — now the first substantive item in the document. 0 hits in 180 calls, the 12-character common prefix, the 1.25x write premium, and the fix being a reordering rather than a rewrite</w:t>
+            </w:r>
+          </w:p>
+        </w:tc>
+      </w:tr>
+      <w:tr>
+        <w:tc>
+          <w:tcPr>
+            <w:tcW w:type="dxa" w:w="3312"/>
+          </w:tcPr>
+          <w:p>
+            <w:pPr>
+              <w:spacing w:line="278" w:lineRule="auto" w:after="0"/>
+            </w:pPr>
+            <w:r/>
+            <w:r>
+              <w:rPr>
+                <w:rFonts w:ascii="Calibri" w:hAnsi="Calibri"/>
+                <w:b/>
+                <w:color w:val="172126"/>
+                <w:sz w:val="15"/>
+              </w:rPr>
+              <w:t>Column counts given for only two sections; state the total table count at the top</w:t>
+            </w:r>
+          </w:p>
+        </w:tc>
+        <w:tc>
+          <w:tcPr>
+            <w:tcW w:type="dxa" w:w="6624"/>
+          </w:tcPr>
+          <w:p>
+            <w:pPr>
+              <w:spacing w:line="278" w:lineRule="auto" w:after="0"/>
+            </w:pPr>
+            <w:r/>
+            <w:r>
+              <w:rPr>
+                <w:rFonts w:ascii="Calibri" w:hAnsi="Calibri"/>
+                <w:b w:val="0"/>
+                <w:color w:val="526068"/>
+                <w:sz w:val="15"/>
+              </w:rPr>
+              <w:t>The header strip on this page carries 83 tables, 3 views, 924 columns, 71 tenant-scoped, 47 foreign keys. Part 2 opens with the same totals and every section now carries its own count, in a table that adds up</w:t>
+            </w:r>
+          </w:p>
+        </w:tc>
+      </w:tr>
+      <w:tr>
+        <w:tc>
+          <w:tcPr>
+            <w:tcW w:type="dxa" w:w="3312"/>
+          </w:tcPr>
+          <w:p>
+            <w:pPr>
+              <w:spacing w:line="278" w:lineRule="auto" w:after="0"/>
+            </w:pPr>
+            <w:r/>
+            <w:r>
+              <w:rPr>
+                <w:rFonts w:ascii="Calibri" w:hAnsi="Calibri"/>
+                <w:b/>
+                <w:color w:val="172126"/>
+                <w:sz w:val="15"/>
+              </w:rPr>
+              <w:t>Backups and restore not covered — document it even if absent</w:t>
+            </w:r>
+          </w:p>
+        </w:tc>
+        <w:tc>
+          <w:tcPr>
+            <w:tcW w:type="dxa" w:w="6624"/>
+          </w:tcPr>
+          <w:p>
+            <w:pPr>
+              <w:spacing w:line="278" w:lineRule="auto" w:after="0"/>
+            </w:pPr>
+            <w:r/>
+            <w:r>
+              <w:rPr>
+                <w:rFonts w:ascii="Calibri" w:hAnsi="Calibri"/>
+                <w:b w:val="0"/>
+                <w:color w:val="526068"/>
+                <w:sz w:val="15"/>
+              </w:rPr>
+              <w:t>Part 9 — and it was not absent but broken. Section 1.2 reports three consecutive nights of 20-byte backups, the cause, the fix, and a verified restore of all 86 objects</w:t>
+            </w:r>
+          </w:p>
+        </w:tc>
+      </w:tr>
+      <w:tr>
+        <w:tc>
+          <w:tcPr>
+            <w:tcW w:type="dxa" w:w="3312"/>
+          </w:tcPr>
+          <w:p>
+            <w:pPr>
+              <w:spacing w:line="278" w:lineRule="auto" w:after="0"/>
+            </w:pPr>
+            <w:r/>
+            <w:r>
+              <w:rPr>
+                <w:rFonts w:ascii="Calibri" w:hAnsi="Calibri"/>
+                <w:b/>
+                <w:color w:val="172126"/>
+                <w:sz w:val="15"/>
+              </w:rPr>
+              <w:t>Branching, deployment and rollback not covered; name the deployment process</w:t>
+            </w:r>
+          </w:p>
+        </w:tc>
+        <w:tc>
+          <w:tcPr>
+            <w:tcW w:type="dxa" w:w="6624"/>
+          </w:tcPr>
+          <w:p>
+            <w:pPr>
+              <w:spacing w:line="278" w:lineRule="auto" w:after="0"/>
+            </w:pPr>
+            <w:r/>
+            <w:r>
+              <w:rPr>
+                <w:rFonts w:ascii="Calibri" w:hAnsi="Calibri"/>
+                <w:b w:val="0"/>
+                <w:color w:val="526068"/>
+                <w:sz w:val="15"/>
+              </w:rPr>
+              <w:t>Part 10. update-from-git.sh is named as the process to use, with why; deploy.ps1 is flagged for shipping the working tree; rollback is covered per layer, including the absence of release tags and of down-migrations</w:t>
+            </w:r>
+          </w:p>
+        </w:tc>
+      </w:tr>
+      <w:tr>
+        <w:tc>
+          <w:tcPr>
+            <w:tcW w:type="dxa" w:w="3312"/>
+          </w:tcPr>
+          <w:p>
+            <w:pPr>
+              <w:spacing w:line="278" w:lineRule="auto" w:after="0"/>
+            </w:pPr>
+            <w:r/>
+            <w:r>
+              <w:rPr>
+                <w:rFonts w:ascii="Calibri" w:hAnsi="Calibri"/>
+                <w:b/>
+                <w:color w:val="172126"/>
+                <w:sz w:val="15"/>
+              </w:rPr>
+              <w:t>Registry still points at claude-opus-4-8; benchmark before switching</w:t>
+            </w:r>
+          </w:p>
+        </w:tc>
+        <w:tc>
+          <w:tcPr>
+            <w:tcW w:type="dxa" w:w="6624"/>
+          </w:tcPr>
+          <w:p>
+            <w:pPr>
+              <w:spacing w:line="278" w:lineRule="auto" w:after="0"/>
+            </w:pPr>
+            <w:r/>
+            <w:r>
+              <w:rPr>
+                <w:rFonts w:ascii="Calibri" w:hAnsi="Calibri"/>
+                <w:b w:val="0"/>
+                <w:color w:val="526068"/>
+                <w:sz w:val="15"/>
+              </w:rPr>
+              <w:t>Section 1.3 and Part 3.4. Both frontier aliases, the point that moving them is an UPDATE rather than a deploy, and the recommendation to benchmark against the eval corpus first and to bump evaluation_version with it</w:t>
+            </w:r>
+          </w:p>
+        </w:tc>
+      </w:tr>
+    </w:tbl>
+    <w:p>
+      <w:pPr>
+        <w:spacing w:after="60"/>
+      </w:pPr>
+    </w:p>
+    <w:tbl>
+      <w:tblPr>
+        <w:tblW w:type="auto" w:w="0"/>
+        <w:tblLook w:firstColumn="1" w:firstRow="1" w:lastColumn="0" w:lastRow="0" w:noHBand="0" w:noVBand="1" w:val="04A0"/>
+        <w:tblBorders>
+          <w:top w:val="single" w:sz="2" w:space="0" w:color="E6F3F1"/>
+          <w:left w:val="single" w:sz="2" w:space="0" w:color="E6F3F1"/>
+          <w:bottom w:val="single" w:sz="2" w:space="0" w:color="E6F3F1"/>
+          <w:right w:val="single" w:sz="2" w:space="0" w:color="E6F3F1"/>
+          <w:insideH w:val="single" w:sz="2" w:space="0" w:color="E6F3F1"/>
+          <w:insideV w:val="single" w:sz="2" w:space="0" w:color="E6F3F1"/>
+        </w:tblBorders>
+      </w:tblPr>
+      <w:tblGrid>
+        <w:gridCol w:w="10080"/>
+      </w:tblGrid>
+      <w:tr>
+        <w:tc>
+          <w:tcPr>
+            <w:tcW w:type="dxa" w:w="10080"/>
+            <w:shd w:val="clear" w:fill="E6F3F1"/>
+          </w:tcPr>
+          <w:p>
+            <w:r/>
+            <w:r>
+              <w:rPr>
+                <w:rFonts w:ascii="Calibri" w:hAnsi="Calibri"/>
+                <w:b/>
+                <w:color w:val="087E75"/>
+                <w:sz w:val="14"/>
+              </w:rPr>
+              <w:t>THE COUNT IN THE EARLIER DOCUMENT WAS WRONG, AND THE REVIEWER’S WAS RIGHT</w:t>
+            </w:r>
+          </w:p>
+          <w:p>
+            <w:pPr>
+              <w:spacing w:before="60" w:line="302" w:lineRule="auto"/>
+            </w:pPr>
+            <w:r>
+              <w:rPr>
+                <w:rFonts w:ascii="Georgia" w:hAnsi="Georgia"/>
+                <w:color w:val="172126"/>
+                <w:sz w:val="17"/>
+              </w:rPr>
+              <w:t>v1.0 said 86 tables, three of which arrived by migration. There are 83 base tables — exactly matching schema.sql — plus 3 views: review_queue, user_effective_permission and calibration_stat. 86 objects, 924 columns. Nothing arrived unaccounted for, and the correction is carried in Part 2 rather than quietly fixed.</w:t>
+            </w:r>
+          </w:p>
+        </w:tc>
+      </w:tr>
+    </w:tbl>
+    <w:p>
+      <w:pPr>
+        <w:spacing w:after="60"/>
       </w:pPr>
     </w:p>
     <w:p>

</xml_diff>